<commit_message>
Redesign to a clinical research-tool look and expand production docs
Replaces the dark luxury theme with a light, cool-toned aesthetic closer
to Scoutly's actual B2B intelligence peers: near-white/slate background,
a precise teal accent, IBM Plex Sans/Mono typography, crisp bordered
cards with a colored left edge instead of ornamental serif type and
heavy shadows. PDF export matches (left-aligned Helvetica report layout,
same palette, no decorative quoting). Screenshots regenerated.

Expands the README's and capstone report's production-architecture
section to explicitly cover authentication, RBAC, tenant isolation,
managed secrets, HTTPS termination, persistent database design, data
retention and privacy, background-job infrastructure, horizontal
scaling, monitoring, and backup/recovery, per the latest review.
</commit_message>
<xml_diff>
--- a/docs/Scoutly_Capstone_Report.docx
+++ b/docs/Scoutly_Capstone_Report.docx
@@ -9,7 +9,7 @@
       </w:pPr>
       <w:r>
         <w:rPr>
-          <w:color w:val="0F172A"/>
+          <w:color w:val="101828"/>
         </w:rPr>
         <w:t>Scoutly</w:t>
       </w:r>
@@ -35,7 +35,7 @@
           <w:color w:val="606060"/>
           <w:sz w:val="22"/>
         </w:rPr>
-        <w:t>CAP 931 Capstone — v1.1</w:t>
+        <w:t>CAP 931 Capstone, v1.2</w:t>
       </w:r>
     </w:p>
     <w:p/>
@@ -49,7 +49,7 @@
     </w:p>
     <w:p>
       <w:r>
-        <w:t>Scoutly is a prototype sales-assistant agent that helps a B2B sales representative research a prospective company before outreach. Given what the rep is selling, their value proposition, the target company's URL, its competitors' URLs, and optionally an uploaded product overview, five chained AI agents produce a one-page account intelligence brief covering company strategy, leadership, press/compliance initiatives, competitive positioning, real 10-K disclosure highlights, a sourcing-strategy recommendation, and a recommended sales approach — grounded in real fetched web pages, real SEC EDGAR filings, and real filing section text rather than general LLM knowledge.</w:t>
+        <w:t>Scoutly is a prototype sales-assistant agent that helps a B2B sales representative research a prospective company before outreach. Given what the rep is selling, their value proposition, the target company's URL, its competitors' URLs, and optionally an uploaded product overview, five chained AI agents produce a one-page account intelligence brief covering company strategy, leadership, press and compliance initiatives, competitive positioning, real 10-K disclosure highlights, a sourcing-strategy recommendation, and a recommended sales approach, grounded in real fetched web pages, real SEC EDGAR filings, and real filing section text rather than general LLM knowledge.</w:t>
       </w:r>
     </w:p>
     <w:p>
@@ -131,7 +131,7 @@
           </w:tcPr>
           <w:p>
             <w:r>
-              <w:t>company_url — fetched live, including discovered subpages, before research runs</w:t>
+              <w:t>company_url, fetched live including discovered subpages before research runs</w:t>
             </w:r>
           </w:p>
         </w:tc>
@@ -153,7 +153,7 @@
           </w:tcPr>
           <w:p>
             <w:r>
-              <w:t>product_category — inferred by the Account Intake Agent when left blank</w:t>
+              <w:t>product_category, inferred by the Account Intake Agent when left blank</w:t>
             </w:r>
           </w:p>
         </w:tc>
@@ -175,7 +175,7 @@
           </w:tcPr>
           <w:p>
             <w:r>
-              <w:t>competitor_urls — each fetched with the same homepage-plus-subpages depth as the target company</w:t>
+              <w:t>competitor_urls, each fetched with the same homepage-plus-subpages depth as the target company</w:t>
             </w:r>
           </w:p>
         </w:tc>
@@ -241,7 +241,7 @@
           </w:tcPr>
           <w:p>
             <w:r>
-              <w:t>product_document_text — PDF/DOCX/TXT upload extracted by document_intake.py, summarized into product_document_summary</w:t>
+              <w:t>product_document_text, a PDF/DOCX/TXT upload extracted by document_intake.py and summarized into product_document_summary</w:t>
             </w:r>
           </w:p>
         </w:tc>
@@ -351,7 +351,7 @@
           </w:tcPr>
           <w:p>
             <w:r>
-              <w:t>report.financial_summary plus report.filing_highlights — real Risk Factors/MD&amp;A/Cybersecurity text fetched from the actual primary filing document, not just filing metadata</w:t>
+              <w:t>report.financial_summary plus report.filing_highlights, real Risk Factors/MD&amp;A/Cybersecurity text fetched from the actual primary filing document, not just filing metadata</w:t>
             </w:r>
           </w:p>
         </w:tc>
@@ -395,7 +395,7 @@
           </w:tcPr>
           <w:p>
             <w:r>
-              <w:t>check_for_updates.py — a real rerun-and-diff mechanism against the account's saved memory, meant to be invoked by an external scheduler (cron/Task Scheduler) since the hosting tier has no persistent background scheduler of its own</w:t>
+              <w:t>check_for_updates.py, a real rerun-and-diff mechanism against the account's saved memory, meant to be invoked by an external scheduler since the hosting tier has no persistent background scheduler of its own</w:t>
             </w:r>
           </w:p>
         </w:tc>
@@ -417,7 +417,7 @@
           </w:tcPr>
           <w:p>
             <w:r>
-              <w:t>eval_models.py — measures JSON/schema compliance, an unsupported-claims proxy, latency, and cost across Claude/GPT-4o-mini/GPT-OSS on the same fixed scenario</w:t>
+              <w:t>eval_models.py measures JSON/schema compliance, an unsupported-claims proxy, latency, and cost across Claude/GPT-4o-mini/GPT-OSS on the same fixed scenario</w:t>
             </w:r>
           </w:p>
         </w:tc>
@@ -447,7 +447,7 @@
     </w:p>
     <w:p>
       <w:r>
-        <w:t>web_research.py fetches the target company's and every competitor's actual web pages (homepage plus discovered leadership/press/about/careers subpages), and performs a free, no-API-key lookup of a company's real SEC EDGAR 10-K filings via EDGAR's full-text-search JSON API. For the single most recent filing, it goes a step further: it locates the primary filing document (via EDGAR's inline-XBRL viewer link) and extracts the actual Risk Factors, MD&amp;A, and Cybersecurity section text — verified live against Palo Alto Networks' real 10-K filings, including correctly returning an empty Cybersecurity section for a 2019 filing that predates that SEC disclosure requirement. A basic SSRF guard blocks non-http(s) schemes and private/loopback/link-local hosts before any fetch.</w:t>
+        <w:t>web_research.py fetches the target company's and every competitor's actual web pages (homepage plus discovered leadership, press, about, and careers subpages), and performs a free, no-API-key lookup of a company's real SEC EDGAR 10-K filings via EDGAR's full-text-search JSON API. For the single most recent filing, it locates the primary filing document via EDGAR's inline-XBRL viewer link and extracts the actual Risk Factors, MD&amp;A, and Cybersecurity section text, verified live against Palo Alto Networks' real 10-K filings, including correctly returning an empty Cybersecurity section for a 2019 filing that predates that SEC disclosure requirement. A basic SSRF guard blocks non-http(s) schemes and private, loopback, and link-local hosts before any fetch.</w:t>
       </w:r>
     </w:p>
     <w:p>
@@ -460,77 +460,7 @@
     </w:p>
     <w:p>
       <w:r>
-        <w:t>Five specific improvements were added in response to a follow-up review of the CAP 931 resubmission:</w:t>
-      </w:r>
-    </w:p>
-    <w:p>
-      <w:pPr>
-        <w:pStyle w:val="ListBullet"/>
-      </w:pPr>
-      <w:r>
-        <w:rPr>
-          <w:b/>
-        </w:rPr>
-        <w:t xml:space="preserve">Competitor subpage discovery: </w:t>
-      </w:r>
-      <w:r>
-        <w:t>Competitors now get the same homepage-plus-subpages fetch depth as the target company, not just a single homepage fetch.</w:t>
-      </w:r>
-    </w:p>
-    <w:p>
-      <w:pPr>
-        <w:pStyle w:val="ListBullet"/>
-      </w:pPr>
-      <w:r>
-        <w:rPr>
-          <w:b/>
-        </w:rPr>
-        <w:t xml:space="preserve">Product-overview upload: </w:t>
-      </w:r>
-      <w:r>
-        <w:t>document_intake.py extracts text from an optionally-uploaded PDF/DOCX/TXT product overview; the Account Intake Agent summarizes and prefers it over sparse manual fields.</w:t>
-      </w:r>
-    </w:p>
-    <w:p>
-      <w:pPr>
-        <w:pStyle w:val="ListBullet"/>
-      </w:pPr>
-      <w:r>
-        <w:rPr>
-          <w:b/>
-        </w:rPr>
-        <w:t xml:space="preserve">Deeper 10-K analysis: </w:t>
-      </w:r>
-      <w:r>
-        <w:t>web_research.fetch_filing_sections retrieves and analyzes real Risk Factors/MD&amp;A/Cybersecurity text from the primary filing document, not just filing metadata.</w:t>
-      </w:r>
-    </w:p>
-    <w:p>
-      <w:pPr>
-        <w:pStyle w:val="ListBullet"/>
-      </w:pPr>
-      <w:r>
-        <w:rPr>
-          <w:b/>
-        </w:rPr>
-        <w:t xml:space="preserve">Real alert system: </w:t>
-      </w:r>
-      <w:r>
-        <w:t>check_for_updates.py reruns Company Research and Competitor research against saved memory and reports genuinely new signals, meant to be invoked by an external scheduler for the 'periodically rerun and notify' behavior a real alert system needs.</w:t>
-      </w:r>
-    </w:p>
-    <w:p>
-      <w:pPr>
-        <w:pStyle w:val="ListBullet"/>
-      </w:pPr>
-      <w:r>
-        <w:rPr>
-          <w:b/>
-        </w:rPr>
-        <w:t xml:space="preserve">Empirical model comparison: </w:t>
-      </w:r>
-      <w:r>
-        <w:t>eval_models.py runs the same fixed scenario through each available provider (fetch mode held constant) and measures schema compliance, retries needed, unsupported-source citations, latency, and estimated cost from real token usage.</w:t>
+        <w:t>Five specific improvements were added in response to a follow-up review: competitor subpage discovery (bringing competitor research to the same depth as company research), an optional product-overview upload (document_intake.py, PDF/DOCX/TXT), real 10-K section-text analysis (web_research.fetch_filing_sections), a rerun-based account-update checker (check_for_updates.py), and an empirical model-comparison harness (eval_models.py).</w:t>
       </w:r>
     </w:p>
     <w:p>
@@ -538,7 +468,25 @@
         <w:pStyle w:val="Heading1"/>
       </w:pPr>
       <w:r>
-        <w:t>6. Production Deployment Considerations</w:t>
+        <w:t>6. Visual Design</w:t>
+      </w:r>
+    </w:p>
+    <w:p>
+      <w:r>
+        <w:t>The interface uses a light, cool-toned palette (a precise teal accent over near-white and slate gray) and IBM Plex Sans/Mono typography, intentionally closer to the modern B2B research and intelligence tools in Scoutly's own product category than to a consumer or luxury-retail aesthetic. Section cards use crisp borders and a colored left-edge accent rather than heavy shadows or ornamental type, and monospace styling is used specifically for URLs and other data values to reinforce the tool's research-grade, data-forward character. The PDF export mirrors this: a plain sans-serif report layout in the same palette, without decorative quoting or centered letterspaced headers.</w:t>
+      </w:r>
+    </w:p>
+    <w:p>
+      <w:pPr>
+        <w:pStyle w:val="Heading1"/>
+      </w:pPr>
+      <w:r>
+        <w:t>7. Production Deployment Considerations</w:t>
+      </w:r>
+    </w:p>
+    <w:p>
+      <w:r>
+        <w:t>What is already true of the prototype:</w:t>
       </w:r>
     </w:p>
     <w:p>
@@ -562,7 +510,7 @@
         <w:pStyle w:val="ListBullet"/>
       </w:pPr>
       <w:r>
-        <w:t>Memory is JSON files today; production would use a real account/CRM database.</w:t>
+        <w:t>Mock mode keeps tests, CI, and grading fully free of API cost and network dependency.</w:t>
       </w:r>
     </w:p>
     <w:p>
@@ -570,7 +518,20 @@
         <w:pStyle w:val="ListBullet"/>
       </w:pPr>
       <w:r>
-        <w:t>check_for_updates.py is the real rerun-and-diff logic a production alert system needs; production would run it from a real scheduler (cron, a managed task scheduler, or a queue-triggered worker) rather than by hand.</w:t>
+        <w:t>uv.lock pins the exact dependency graph for reproducible environments.</w:t>
+      </w:r>
+    </w:p>
+    <w:p>
+      <w:r>
+        <w:t>What an enterprise, multi-tenant deployment would add:</w:t>
+      </w:r>
+    </w:p>
+    <w:p>
+      <w:r>
+        <w:rPr>
+          <w:b/>
+        </w:rPr>
+        <w:t>Authentication and access control</w:t>
       </w:r>
     </w:p>
     <w:p>
@@ -578,7 +539,7 @@
         <w:pStyle w:val="ListBullet"/>
       </w:pPr>
       <w:r>
-        <w:t>eval_models.py's cost estimates use real token counts but an illustrative, manually-maintained pricing table; production cost tracking should read pricing from each provider's billing API instead.</w:t>
+        <w:t>Real user authentication (SSO/OAuth via an identity provider such as Okta, Azure AD, or Auth0) in place of the single shared browser session used today.</w:t>
       </w:r>
     </w:p>
     <w:p>
@@ -586,7 +547,127 @@
         <w:pStyle w:val="ListBullet"/>
       </w:pPr>
       <w:r>
-        <w:t>Mock mode keeps tests, CI, and grading fully free of API cost and network dependency.</w:t>
+        <w:t>Role-based access control: a rep sees their own accounts, a manager sees their team's accounts, an admin manages provider keys and webhook destinations.</w:t>
+      </w:r>
+    </w:p>
+    <w:p>
+      <w:pPr>
+        <w:pStyle w:val="ListBullet"/>
+      </w:pPr>
+      <w:r>
+        <w:t>Tenant isolation, enforced at the database and API layer using the existing account_id partition key, not by file-naming convention.</w:t>
+      </w:r>
+    </w:p>
+    <w:p>
+      <w:r>
+        <w:rPr>
+          <w:b/>
+        </w:rPr>
+        <w:t>Secrets and network security</w:t>
+      </w:r>
+    </w:p>
+    <w:p>
+      <w:pPr>
+        <w:pStyle w:val="ListBullet"/>
+      </w:pPr>
+      <w:r>
+        <w:t>Managed secrets (AWS Secrets Manager, GCP Secret Manager, or HashiCorp Vault) with rotation and audit logging, replacing the current .env/Streamlit-secrets approach.</w:t>
+      </w:r>
+    </w:p>
+    <w:p>
+      <w:pPr>
+        <w:pStyle w:val="ListBullet"/>
+      </w:pPr>
+      <w:r>
+        <w:t>HTTPS termination at a load balancer or reverse proxy for a self-hosted deployment (Streamlit Cloud already terminates TLS for the current deployment).</w:t>
+      </w:r>
+    </w:p>
+    <w:p>
+      <w:pPr>
+        <w:pStyle w:val="ListBullet"/>
+      </w:pPr>
+      <w:r>
+        <w:t>The existing SSRF guard remains load-bearing in any deployment, since the app fetches user-supplied URLs server-side regardless of hosting.</w:t>
+      </w:r>
+    </w:p>
+    <w:p>
+      <w:r>
+        <w:rPr>
+          <w:b/>
+        </w:rPr>
+        <w:t>Data persistence and privacy</w:t>
+      </w:r>
+    </w:p>
+    <w:p>
+      <w:pPr>
+        <w:pStyle w:val="ListBullet"/>
+      </w:pPr>
+      <w:r>
+        <w:t>A real relational schema (accounts, research_history, documents tables, likely on Postgres) replacing the current per-account JSON memory files.</w:t>
+      </w:r>
+    </w:p>
+    <w:p>
+      <w:pPr>
+        <w:pStyle w:val="ListBullet"/>
+      </w:pPr>
+      <w:r>
+        <w:t>An explicit data-retention policy, a real deletion path for tenant offboarding or privacy requests, and encryption at rest for uploaded documents and research data.</w:t>
+      </w:r>
+    </w:p>
+    <w:p>
+      <w:r>
+        <w:rPr>
+          <w:b/>
+        </w:rPr>
+        <w:t>Background jobs and horizontal scaling</w:t>
+      </w:r>
+    </w:p>
+    <w:p>
+      <w:pPr>
+        <w:pStyle w:val="ListBullet"/>
+      </w:pPr>
+      <w:r>
+        <w:t>check_for_updates.py's rerun-and-diff logic running as a real job queue per tenant per account (Celery, SQS plus Lambda, or a managed cloud scheduler), decoupled from the web process.</w:t>
+      </w:r>
+    </w:p>
+    <w:p>
+      <w:pPr>
+        <w:pStyle w:val="ListBullet"/>
+      </w:pPr>
+      <w:r>
+        <w:t>Separating the stateless agent-orchestration layer, scalable behind a load balancer, from the stateful memory layer, so multiple app instances can serve requests concurrently.</w:t>
+      </w:r>
+    </w:p>
+    <w:p>
+      <w:pPr>
+        <w:pStyle w:val="ListBullet"/>
+      </w:pPr>
+      <w:r>
+        <w:t>Real exponential backoff and rate-limit handling for LLM calls and page fetches, beyond the current single corrective retry.</w:t>
+      </w:r>
+    </w:p>
+    <w:p>
+      <w:r>
+        <w:rPr>
+          <w:b/>
+        </w:rPr>
+        <w:t>Monitoring and recovery</w:t>
+      </w:r>
+    </w:p>
+    <w:p>
+      <w:pPr>
+        <w:pStyle w:val="ListBullet"/>
+      </w:pPr>
+      <w:r>
+        <w:t>Structured logging and metrics (for example OpenTelemetry into Datadog or Grafana) tracking per-agent latency, retry rate, and the same compliance signals eval_models.py measures, continuously rather than in a one-off run.</w:t>
+      </w:r>
+    </w:p>
+    <w:p>
+      <w:pPr>
+        <w:pStyle w:val="ListBullet"/>
+      </w:pPr>
+      <w:r>
+        <w:t>Standard point-in-time database backups, a tested restore path, and a defined recovery point and time objective.</w:t>
       </w:r>
     </w:p>
     <w:p>
@@ -594,12 +675,12 @@
         <w:pStyle w:val="Heading1"/>
       </w:pPr>
       <w:r>
-        <w:t>7. Time Management</w:t>
+        <w:t>8. Time Management</w:t>
       </w:r>
     </w:p>
     <w:p>
       <w:r>
-        <w:t>Initial five-agent pipeline, real page-fetching layer, and SEC EDGAR filing-metadata lookup; then the table-grounded sourcing-strategy recommendation; then a split into this standalone repository with a full visual redesign, refined further into a high-end look matching the boutique/luxury retail clientele the example scenarios target; then the five follow-up enhancements in section 5, each scoped to be real and working rather than a superficial stub.</w:t>
+        <w:t>Initial five-agent pipeline, real page-fetching layer, and SEC EDGAR filing-metadata lookup; then the table-grounded sourcing-strategy recommendation; then a split into a standalone repository with a full visual redesign, refined twice more since, first toward a high-end look and then toward the clinical research-tool look described in section 6; then the five follow-up enhancements in section 5, each scoped to be real and working rather than a superficial stub; then the expanded production architecture documentation in section 7.</w:t>
       </w:r>
     </w:p>
     <w:p>
@@ -607,7 +688,7 @@
         <w:pStyle w:val="Heading1"/>
       </w:pPr>
       <w:r>
-        <w:t>8. Challenges and Solutions</w:t>
+        <w:t>9. Challenges and Solutions</w:t>
       </w:r>
     </w:p>
     <w:p>
@@ -677,7 +758,7 @@
         <w:t xml:space="preserve">Problem: </w:t>
       </w:r>
       <w:r>
-        <w:t>Streamlit Cloud's free tier has no persistent background scheduler, so a real 'periodically rerun and notify' alert system can't live inside the app process.</w:t>
+        <w:t>Streamlit Cloud's free tier has no persistent background scheduler, so a real periodically-rerun-and-notify alert system can't live inside the app process.</w:t>
       </w:r>
     </w:p>
     <w:p>
@@ -719,7 +800,7 @@
         <w:t xml:space="preserve">Fix: </w:t>
       </w:r>
       <w:r>
-        <w:t>eval_models.py gracefully skips any provider without a configured key and never fabricates a result row — it is built and verified to run correctly, with real numbers left for whoever runs it with real keys.</w:t>
+        <w:t>eval_models.py gracefully skips any provider without a configured key and never fabricates a result row; it is built and verified to run correctly, with real numbers left for whoever runs it with real keys.</w:t>
       </w:r>
     </w:p>
     <w:p>
@@ -727,12 +808,12 @@
         <w:pStyle w:val="Heading1"/>
       </w:pPr>
       <w:r>
-        <w:t>9. Testing</w:t>
+        <w:t>10. Testing</w:t>
       </w:r>
     </w:p>
     <w:p>
       <w:r>
-        <w:t>55 automated pytest tests cover the LLM provider factory, the page-fetching and 10-K-section-extraction layer (pure functions, no live network calls), document text extraction (PDF/DOCX/TXT fixtures built in memory), the model-comparison harness's pure functions, memory update/dedup/persistence, each agent in isolation, and the full five-agent pipeline end to end including check_for_updates' rerun-and-diff logic. All tests run offline against the mock LLM client and mock fetcher.</w:t>
+        <w:t>55 automated pytest tests cover the LLM provider factory, the page-fetching and 10-K-section-extraction layer as pure functions with no live network calls, document text extraction from PDF/DOCX/TXT fixtures built in memory, the model-comparison harness's pure functions, memory update/dedup/persistence, each agent in isolation, and the full five-agent pipeline end to end including check_for_updates' rerun-and-diff logic. All tests run offline against the mock LLM client and mock fetcher.</w:t>
       </w:r>
     </w:p>
     <w:p/>

</xml_diff>